<commit_message>
Episode 7 compression pass (v3): 1,570 -> 1,098 dialogue words, ~9:55 est.
All protections intact (phrase bank, emotional beats, silences, V6 callback,
translatable VO lines). Editor re-check in progress; final state to follow.

Co-Authored-By: Claude Fable 5 <noreply@anthropic.com>
Claude-Session: https://claude.ai/code/session_01BbznzE6vYuuAPK9F9HY6r3
</commit_message>
<xml_diff>
--- a/restaurant-track/video-07-english-freezes/RAMP_EnglishFreezes_VideoScript.docx
+++ b/restaurant-track/video-07-english-freezes/RAMP_EnglishFreezes_VideoScript.docx
@@ -30,13 +30,7 @@
         <w:t>Status:</w:t>
       </w:r>
       <w:r>
-        <w:t xml:space="preserve"> DRAFT v2 — editor-passed, awaiting Ruthy review </w:t>
-      </w:r>
-      <w:r>
-        <w:rPr>
-          <w:i/>
-        </w:rPr>
-        <w:t>(⚠️ runtime flag: dialogue runs ~14–16 min at checklist pacing against an ~8-min target — needs a scriptwriter compression pass; specifics in "Editor's notes to scriptwriter" below)</w:t>
+        <w:t xml:space="preserve"> DRAFT v3 — compressed per editor notes, awaiting editor re-check</w:t>
       </w:r>
     </w:p>
     <w:p>
@@ -268,7 +262,7 @@
         <w:t>MARIA (VO):</w:t>
       </w:r>
       <w:r>
-        <w:t xml:space="preserve"> Nobody was rude to me. Nobody spoke fast. My own English just… stopped.</w:t>
+        <w:t xml:space="preserve"> Nobody was rude. Nobody spoke fast. My English just… stopped.</w:t>
       </w:r>
     </w:p>
     <w:p/>
@@ -292,7 +286,7 @@
         <w:t>MARIA (VO):</w:t>
       </w:r>
       <w:r>
-        <w:t xml:space="preserve"> If that voice lives in your head too — this video is for you. There are phrases for this exact moment. Professionals use them every day. Let me show you.</w:t>
+        <w:t xml:space="preserve"> If that voice lives in your head too — stay. There are phrases for this exact moment.</w:t>
       </w:r>
     </w:p>
     <w:p/>
@@ -302,7 +296,7 @@
         <w:pStyle w:val="Heading2"/>
       </w:pPr>
       <w:r>
-        <w:t>PART 1 — THE FRAME (0:30–1:50)</w:t>
+        <w:t>PART 1 — THE FRAME (0:30–2:05)</w:t>
       </w:r>
     </w:p>
     <w:p/>
@@ -323,7 +317,7 @@
         <w:t>JAMES:</w:t>
       </w:r>
       <w:r>
-        <w:t xml:space="preserve"> Table 6 tonight. You went somewhere for a second.</w:t>
+        <w:t xml:space="preserve"> Table 6. You went somewhere for a second.</w:t>
       </w:r>
     </w:p>
     <w:p/>
@@ -335,7 +329,7 @@
         <w:t>MARIA:</w:t>
       </w:r>
       <w:r>
-        <w:t xml:space="preserve"> Capers. The word was capers. I've said it a hundred times. And it just — left. And you know what I did after? I gave table 6 to Priya and I hid in the side station.</w:t>
+        <w:t xml:space="preserve"> Capers. I've said that word a hundred times, and it just left. So I gave the table to Priya and hid in the side station.</w:t>
       </w:r>
     </w:p>
     <w:p/>
@@ -389,7 +383,7 @@
         <w:t>JAMES:</w:t>
       </w:r>
       <w:r>
-        <w:t xml:space="preserve"> Because everybody sells "speak without fear," and nobody teaches the two seconds where the fear actually lives. Okay. First, the thing you need to know more than any phrase: the freeze is not your English failing. It's a brain thing, and every brain does it. I've spoken English my whole life, and my mind still hits a… </w:t>
+        <w:t xml:space="preserve"> The freeze is not your English failing — every brain does it. Mine still hits a… </w:t>
       </w:r>
       <w:r>
         <w:rPr>
@@ -422,7 +416,7 @@
         <w:t>JAMES:</w:t>
       </w:r>
       <w:r>
-        <w:t xml:space="preserve"> I did it on purpose. Mostly. But you've heard me do it for real — Tuesday, in the staff meeting, I lost "inventory." Me. In my own restaurant. Did you think I was stupid?</w:t>
+        <w:t xml:space="preserve"> On purpose. Mostly. But Tuesday, in my own staff meeting, I lost "inventory." Did you think I was stupid?</w:t>
       </w:r>
     </w:p>
     <w:p/>
@@ -446,7 +440,7 @@
         <w:t>JAMES:</w:t>
       </w:r>
       <w:r>
-        <w:t xml:space="preserve"> Exactly. Because I didn't go silent — I made a sound, kept the moment alive, and the word came back. Native speakers freeze constantly. We just have a toolbox for it, and nobody ever hands it to you in a textbook. So tonight I'm handing it to you. Three moves: make a sound, say what you have, and find your way back.</w:t>
+        <w:t xml:space="preserve"> Because I made a sound, not a silence — and the word came back. Native speakers freeze constantly — we just carry a toolbox. Tonight it's yours: make a sound, say what you have, find your way back.</w:t>
       </w:r>
     </w:p>
     <w:p/>
@@ -458,7 +452,7 @@
         <w:t>MARIA:</w:t>
       </w:r>
       <w:r>
-        <w:t xml:space="preserve"> And you'll be the customer.</w:t>
+        <w:t xml:space="preserve"> And you're the customer.</w:t>
       </w:r>
     </w:p>
     <w:p/>
@@ -470,7 +464,7 @@
         <w:t>JAMES:</w:t>
       </w:r>
       <w:r>
-        <w:t xml:space="preserve"> I'll be the customer. Get the pad.</w:t>
+        <w:t xml:space="preserve"> Get the pad.</w:t>
       </w:r>
     </w:p>
     <w:p/>
@@ -480,7 +474,7 @@
         <w:pStyle w:val="Heading2"/>
       </w:pPr>
       <w:r>
-        <w:t>PART 2 — SKILL 1: MAKE A SOUND, NOT A SILENCE (1:50–3:20)</w:t>
+        <w:t>PART 2 — SKILL 1: MAKE A SOUND, NOT A SILENCE (2:05–3:15)</w:t>
       </w:r>
     </w:p>
     <w:p/>
@@ -501,7 +495,7 @@
         <w:t>JAMES (as himself, aside):</w:t>
       </w:r>
       <w:r>
-        <w:t xml:space="preserve"> Here's the secret of the freeze: the freeze isn't what scares the customer. The SILENCE is. A server who pauses with sound is thinking. A server who goes silent looks like the fire alarm's about to ring. So the first move is small: buy the time out loud. </w:t>
+        <w:t xml:space="preserve"> The freeze doesn't scare a customer — the silence does. Sound says you're thinking. So buy time out loud: </w:t>
       </w:r>
       <w:r>
         <w:rPr>
@@ -540,22 +534,13 @@
         <w:t>JAMES:</w:t>
       </w:r>
       <w:r>
-        <w:t xml:space="preserve"> Hear what that sentence does? You didn't confess a problem. You promised quality. Your freeze just became service. Now — sometimes one second isn't enough, and the whole sentence falls down. That's allowed. Name it and reset. Two phrases, they're a pair: </w:t>
+        <w:t xml:space="preserve"> You promised quality — your freeze just became service. And when a whole sentence falls down, name it and reset — a pair native speakers use every day: </w:t>
       </w:r>
       <w:r>
         <w:rPr>
           <w:i/>
         </w:rPr>
-        <w:t>"Sorry — my mind just went blank."</w:t>
-      </w:r>
-      <w:r>
-        <w:t xml:space="preserve"> Then: </w:t>
-      </w:r>
-      <w:r>
-        <w:rPr>
-          <w:i/>
-        </w:rPr>
-        <w:t>"Let me start again."</w:t>
+        <w:t>"Sorry — my mind just went blank. Let me start again."</w:t>
       </w:r>
     </w:p>
     <w:p/>
@@ -597,22 +582,10 @@
         <w:rPr>
           <w:b/>
         </w:rPr>
-        <w:t>JAMES (as himself):</w:t>
-      </w:r>
-      <w:r>
-        <w:t xml:space="preserve"> That's the answer you'll get, by the way. Almost every time. "My mind went blank" is a NATIVE phrase — Americans say it in meetings, on dates, on television. When you say it, you don't sound like a learner. You sound like everyone.</w:t>
-      </w:r>
-    </w:p>
-    <w:p/>
-    <w:p>
-      <w:r>
-        <w:rPr>
-          <w:b/>
-        </w:rPr>
         <w:t>MARIA:</w:t>
       </w:r>
       <w:r>
-        <w:t xml:space="preserve"> So the phrase I was afraid to say… is the phrase that makes me sound normal.</w:t>
+        <w:t xml:space="preserve"> So the phrase I was afraid to say… makes me sound normal.</w:t>
       </w:r>
     </w:p>
     <w:p/>
@@ -624,7 +597,7 @@
         <w:t>JAMES:</w:t>
       </w:r>
       <w:r>
-        <w:t xml:space="preserve"> Now you're getting it. One more sound for the toolbox — the one I used on you five minutes ago: </w:t>
+        <w:t xml:space="preserve"> One more — the sound I used on you earlier: </w:t>
       </w:r>
       <w:r>
         <w:rPr>
@@ -633,7 +606,7 @@
         <w:t>"What's the word I want…"</w:t>
       </w:r>
       <w:r>
-        <w:t xml:space="preserve"> Say it slowly, look up, even snap your fingers. That's not a student searching. That's a fluent person mid-search — it's the most native noise in this whole episode.</w:t>
+        <w:t xml:space="preserve"> Eyes up, slow. A fluent person mid-search.</w:t>
       </w:r>
     </w:p>
     <w:p/>
@@ -655,18 +628,6 @@
       </w:r>
       <w:r>
         <w:t xml:space="preserve"> What's the word I want…</w:t>
-      </w:r>
-    </w:p>
-    <w:p/>
-    <w:p>
-      <w:r>
-        <w:rPr>
-          <w:b/>
-        </w:rPr>
-        <w:t>JAMES (as himself):</w:t>
-      </w:r>
-      <w:r>
-        <w:t xml:space="preserve"> There. You could freeze in front of the whole dining room with that and nobody would blink.</w:t>
       </w:r>
     </w:p>
     <w:p/>
@@ -676,7 +637,7 @@
         <w:pStyle w:val="Heading2"/>
       </w:pPr>
       <w:r>
-        <w:t>PART 3 — SKILL 2: SAY WHAT YOU HAVE (3:20–4:55)</w:t>
+        <w:t>PART 3 — SKILL 2: SAY WHAT YOU HAVE (3:15–4:35)</w:t>
       </w:r>
     </w:p>
     <w:p/>
@@ -688,7 +649,7 @@
         <w:t>JAMES (as himself):</w:t>
       </w:r>
       <w:r>
-        <w:t xml:space="preserve"> Move two. Sometimes the word doesn't come back — fine. Here's what the panic makes you forget: you lost ONE WORD. Not the meaning. The meaning is still in your head, so hand me the meaning. Start with: </w:t>
+        <w:t xml:space="preserve"> Move two, for when the word doesn't come back. You lost one word, not the meaning — so hand me the meaning: </w:t>
       </w:r>
       <w:r>
         <w:rPr>
@@ -697,7 +658,7 @@
         <w:t>"It's the one with…"</w:t>
       </w:r>
       <w:r>
-        <w:t xml:space="preserve"> — and describe it. Simple words. Use your hands. Sell it to me without the word "capers."</w:t>
+        <w:t xml:space="preserve"> Use your hands. Sell me the salmon without "capers."</w:t>
       </w:r>
     </w:p>
     <w:p/>
@@ -727,7 +688,7 @@
         <w:t>(fingertips)</w:t>
       </w:r>
       <w:r>
-        <w:t xml:space="preserve"> — they come in the lemon sauce.</w:t>
+        <w:t xml:space="preserve"> — in the lemon sauce.</w:t>
       </w:r>
     </w:p>
     <w:p/>
@@ -763,7 +724,7 @@
         <w:t>JAMES (as himself):</w:t>
       </w:r>
       <w:r>
-        <w:t xml:space="preserve"> Look what happened. You froze, and the customer didn't watch you fail — he PLAYED. People love finishing a puzzle. Which brings me to the move you're going to hate before you love it. When you're stuck, you're allowed to just ask: </w:t>
+        <w:t xml:space="preserve"> He didn't watch you fail — he played. Which brings me to the move you'll hate before you love it. When you're stuck, just ask: </w:t>
       </w:r>
       <w:r>
         <w:rPr>
@@ -826,7 +787,7 @@
         <w:t>JAMES:</w:t>
       </w:r>
       <w:r>
-        <w:t xml:space="preserve"> I know it does. Now watch his face when you ask. </w:t>
+        <w:t xml:space="preserve"> I know. But watch him. </w:t>
       </w:r>
       <w:r>
         <w:rPr>
@@ -835,7 +796,7 @@
         <w:t>(as the customer — leans in, delighted)</w:t>
       </w:r>
       <w:r>
-        <w:t xml:space="preserve"> People light up, Maria. You handed him a tiny job and he loved it. For ten seconds he's not your judge — he's your teammate. Asking isn't defeat. Asking is what confident people do, because they know one word was never the job. The salmon is the job. You know the salmon.</w:t>
+        <w:t xml:space="preserve"> People light up. You handed him a tiny puzzle and he loved it — he's your teammate, not your judge. The salmon is the job. You know the salmon.</w:t>
       </w:r>
     </w:p>
     <w:p/>
@@ -848,18 +809,6 @@
       </w:r>
       <w:r>
         <w:t xml:space="preserve"> I know everything about that salmon except one word.</w:t>
-      </w:r>
-    </w:p>
-    <w:p/>
-    <w:p>
-      <w:r>
-        <w:rPr>
-          <w:b/>
-        </w:rPr>
-        <w:t>JAMES:</w:t>
-      </w:r>
-      <w:r>
-        <w:t xml:space="preserve"> And now you have three ways to serve it anyway.</w:t>
       </w:r>
     </w:p>
     <w:p/>
@@ -869,7 +818,7 @@
         <w:pStyle w:val="Heading2"/>
       </w:pPr>
       <w:r>
-        <w:t>PART 4 — SKILL 3: THE WAY BACK (4:55–6:10)</w:t>
+        <w:t>PART 4 — SKILL 3: THE WAY BACK (4:35–6:45)</w:t>
       </w:r>
     </w:p>
     <w:p/>
@@ -881,7 +830,7 @@
         <w:t>JAMES (as himself):</w:t>
       </w:r>
       <w:r>
-        <w:t xml:space="preserve"> Last move — the one that decides whether this costs you a word or costs you the whole night. Two halves. First, out loud: after the freeze, don't rebuild the sentence in your head like it never happened. Find your place with sound: </w:t>
+        <w:t xml:space="preserve"> Last move. Don't replay the freeze in your head — find your place out loud: </w:t>
       </w:r>
       <w:r>
         <w:rPr>
@@ -889,9 +838,6 @@
         </w:rPr>
         <w:t>"Where was I? — Right."</w:t>
       </w:r>
-      <w:r>
-        <w:t xml:space="preserve"> And carry on.</w:t>
-      </w:r>
     </w:p>
     <w:p/>
     <w:p>
@@ -923,7 +869,7 @@
         <w:t>JAMES:</w:t>
       </w:r>
       <w:r>
-        <w:t xml:space="preserve"> Clean. Second half — and this one is yours to use or not, it's a choice, never a duty: </w:t>
+        <w:t xml:space="preserve"> Clean. One more — always a choice, never a duty: </w:t>
       </w:r>
       <w:r>
         <w:rPr>
@@ -962,7 +908,7 @@
         <w:t>JAMES:</w:t>
       </w:r>
       <w:r>
-        <w:t xml:space="preserve"> Again. Chin up this time. It's not an apology — it's information. And listen to the second half: "thank you for your patience." You're not asking permission. You're telling them, kindly, how to behave.</w:t>
+        <w:t xml:space="preserve"> Again — chin up. Not an apology; information. You're telling them, kindly, how to behave.</w:t>
       </w:r>
     </w:p>
     <w:p/>
@@ -986,7 +932,7 @@
         <w:t>JAMES:</w:t>
       </w:r>
       <w:r>
-        <w:t xml:space="preserve"> THAT one. Same words, different server. Now the half nobody can hear — the walk to the kitchen afterward. Tonight you gave away a table and hid in the side station. What was the voice saying?</w:t>
+        <w:t xml:space="preserve"> THAT one. Same words, different server. Now the walk back to the kitchen — what was the voice saying?</w:t>
       </w:r>
     </w:p>
     <w:p/>
@@ -1019,7 +965,7 @@
         <w:t>JAMES:</w:t>
       </w:r>
       <w:r>
-        <w:t xml:space="preserve"> Then let's look at the moment. Can I tell you what I actually saw from the bar? A server lost a word. That's all that happened. The customer forgot it before his drink arrived — you're the only person in the building still carrying it. And Maria — the server who handled table 12 last Friday? Fast customers, angry customers, the kitchen on a bad night? Same person standing here. One frozen sentence doesn't erase one shift of that. It can't. It's one sentence.</w:t>
+        <w:t xml:space="preserve"> Here's what I saw from the bar: a server lost a word. That's all. The customer forgot it before his drink arrived — you're the only person in the building still carrying it. And the server who handled table 12 last Friday? Same person standing here.</w:t>
       </w:r>
     </w:p>
     <w:p/>
@@ -1068,7 +1014,7 @@
         <w:pStyle w:val="Heading2"/>
       </w:pPr>
       <w:r>
-        <w:t>PART 5 — THE PAYOFF (6:10–7:05)</w:t>
+        <w:t>PART 5 — THE PAYOFF (6:45–7:55)</w:t>
       </w:r>
     </w:p>
     <w:p/>
@@ -1089,7 +1035,7 @@
         <w:t>MARIA (VO):</w:t>
       </w:r>
       <w:r>
-        <w:t xml:space="preserve"> Same table. Same salmon. And I want to be honest with you, because nobody selling "English without fear" ever is: the freeze came back.</w:t>
+        <w:t xml:space="preserve"> Same table. Same salmon. Nobody selling "English without fear" tells you this: the freeze came back.</w:t>
       </w:r>
     </w:p>
     <w:p/>
@@ -1146,7 +1092,7 @@
         <w:t>MARIA:</w:t>
       </w:r>
       <w:r>
-        <w:t xml:space="preserve"> Capers — thank you! Lemon-caper sauce. It's the best thing on the menu tonight.</w:t>
+        <w:t xml:space="preserve"> Capers — thank you! Lemon-caper sauce.</w:t>
       </w:r>
     </w:p>
     <w:p/>
@@ -1158,7 +1104,7 @@
         <w:t>JAMES (as customer, chuckling):</w:t>
       </w:r>
       <w:r>
-        <w:t xml:space="preserve"> Well, now I have to order it. I helped.</w:t>
+        <w:t xml:space="preserve"> Now I have to order it. I helped.</w:t>
       </w:r>
     </w:p>
     <w:p/>
@@ -1170,7 +1116,7 @@
         <w:t>MARIA:</w:t>
       </w:r>
       <w:r>
-        <w:t xml:space="preserve"> Where was I? — Right. It comes with roasted potatoes or the seasonal salad — which would you like?</w:t>
+        <w:t xml:space="preserve"> Where was I? — Right. Roasted potatoes or seasonal salad — which would you like?</w:t>
       </w:r>
     </w:p>
     <w:p/>
@@ -1182,7 +1128,7 @@
         <w:t>MARIA (VO):</w:t>
       </w:r>
       <w:r>
-        <w:t xml:space="preserve"> I still froze. Same word, same table. But this time the silence didn't swallow me — I had somewhere to put my feet.</w:t>
+        <w:t xml:space="preserve"> I still froze. But the silence didn't swallow me — I had somewhere to put my feet.</w:t>
       </w:r>
     </w:p>
     <w:p/>
@@ -1213,7 +1159,7 @@
         <w:pStyle w:val="Heading2"/>
       </w:pPr>
       <w:r>
-        <w:t>RECAP SEGMENT — ANIMATED WHITEBOARD QUIZ (7:05–8:10)</w:t>
+        <w:t>RECAP SEGMENT — ANIMATED WHITEBOARD QUIZ (7:55–9:20)</w:t>
       </w:r>
     </w:p>
     <w:p/>
@@ -1234,7 +1180,7 @@
         <w:t>JAMES:</w:t>
       </w:r>
       <w:r>
-        <w:t xml:space="preserve"> Recap. Answer out loud, wherever you are — especially if there's nobody around to hear you freeze.</w:t>
+        <w:t xml:space="preserve"> Recap — answer out loud, even if nobody's listening.</w:t>
       </w:r>
     </w:p>
     <w:p/>
@@ -1246,7 +1192,7 @@
         <w:t>JAMES:</w:t>
       </w:r>
       <w:r>
-        <w:t xml:space="preserve"> Question one: mid-sentence, the word disappears. What's the first rule?</w:t>
+        <w:t xml:space="preserve"> Question one: the word disappears mid-sentence. First rule?</w:t>
       </w:r>
     </w:p>
     <w:p>
@@ -1265,7 +1211,7 @@
         <w:t>MARIA:</w:t>
       </w:r>
       <w:r>
-        <w:t xml:space="preserve"> Make a sound, not a silence. "Give me one second — I want to get this exactly right." Or think out loud: "What's the word I want…"</w:t>
+        <w:t xml:space="preserve"> Make a sound, not a silence. "Give me one second — I want to get this exactly right." Or: "What's the word I want…"</w:t>
       </w:r>
     </w:p>
     <w:p/>
@@ -1277,7 +1223,7 @@
         <w:t>JAMES:</w:t>
       </w:r>
       <w:r>
-        <w:t xml:space="preserve"> Question two: the whole sentence falls down. Two phrases — the pair?</w:t>
+        <w:t xml:space="preserve"> Question two: the whole sentence falls down. The pair?</w:t>
       </w:r>
     </w:p>
     <w:p>
@@ -1308,7 +1254,7 @@
         <w:t>JAMES:</w:t>
       </w:r>
       <w:r>
-        <w:t xml:space="preserve"> Question three: the word won't come back at all. What do you hand the customer instead?</w:t>
+        <w:t xml:space="preserve"> Question three: the word won't come back. What do you hand them?</w:t>
       </w:r>
     </w:p>
     <w:p>
@@ -1327,7 +1273,7 @@
         <w:t>MARIA:</w:t>
       </w:r>
       <w:r>
-        <w:t xml:space="preserve"> The meaning. "It's the one with…" — simple words, use your hands. Or just ask: "How do you say…?" They love to help.</w:t>
+        <w:t xml:space="preserve"> The meaning. "It's the one with…" — or just ask: "How do you say…?"</w:t>
       </w:r>
     </w:p>
     <w:p/>
@@ -1339,7 +1285,7 @@
         <w:t>JAMES:</w:t>
       </w:r>
       <w:r>
-        <w:t xml:space="preserve"> Question four: the freeze is over. How do you find your place?</w:t>
+        <w:t xml:space="preserve"> Question four: the freeze ends. How do you find your place?</w:t>
       </w:r>
     </w:p>
     <w:p>
@@ -1358,7 +1304,7 @@
         <w:t>MARIA:</w:t>
       </w:r>
       <w:r>
-        <w:t xml:space="preserve"> Out loud: "Where was I? — Right." And keep going. Don't replay it.</w:t>
+        <w:t xml:space="preserve"> Out loud: "Where was I? — Right." And keep going.</w:t>
       </w:r>
     </w:p>
     <w:p/>
@@ -1389,7 +1335,7 @@
         <w:t>MARIA:</w:t>
       </w:r>
       <w:r>
-        <w:t xml:space="preserve"> Information. Chin up, and it's a choice — I never owe it to anyone. And one frozen sentence erases… nothing.</w:t>
+        <w:t xml:space="preserve"> Information. Chin up — and it's my choice. And one frozen sentence erases… nothing.</w:t>
       </w:r>
     </w:p>
     <w:p/>
@@ -1408,7 +1354,7 @@
         <w:pStyle w:val="Heading2"/>
       </w:pPr>
       <w:r>
-        <w:t>OUTRO + CTA (8:10–8:40)</w:t>
+        <w:t>OUTRO + CTA (9:20–9:55)</w:t>
       </w:r>
     </w:p>
     <w:p/>
@@ -1420,7 +1366,7 @@
         <w:t>MARIA:</w:t>
       </w:r>
       <w:r>
-        <w:t xml:space="preserve"> Your English is going to freeze next shift. That's not a maybe — it comes with a second language, and it comes with a first one too. So when it happens: make a sound. Then tell us in the comments which phrase carried you — we read every single one.</w:t>
+        <w:t xml:space="preserve"> Your English will freeze next shift. That's not a maybe — it comes with a second language, and it comes with a first one too. When it happens, make a sound. And tell us which phrase carried you — we read every comment.</w:t>
       </w:r>
     </w:p>
     <w:p/>
@@ -1444,7 +1390,7 @@
         <w:t>MARIA:</w:t>
       </w:r>
       <w:r>
-        <w:t xml:space="preserve"> Subscribe so you don't miss it. We're Two Colleagues —</w:t>
+        <w:t xml:space="preserve"> Subscribe. We're Two Colleagues —</w:t>
       </w:r>
     </w:p>
     <w:p/>
@@ -2037,6 +1983,134 @@
           <w:i/>
         </w:rPr>
         <w:t>(Minor, roll into the same pass: "Americans say it in meetings, on dates, on television" — the triple list reads written; two items land more spoken.)</w:t>
+      </w:r>
+    </w:p>
+    <w:p/>
+    <w:p>
+      <w:pPr>
+        <w:pStyle w:val="Heading2"/>
+      </w:pPr>
+      <w:r>
+        <w:t>Scriptwriter revision notes (v3 compression pass, 2026-07-16)</w:t>
+      </w:r>
+    </w:p>
+    <w:p/>
+    <w:p>
+      <w:r>
+        <w:t>Dialogue cut from 1,625 to 1,098 (speaker-line tokenizer; the editor's counter read the same v2 text ~3% lower, so this sits safely under the 1,100 ceiling) ≈ 9.2–10.5 min at 105–120 wpm. Scene-header timings recomputed at real channel pacing plus the designed pauses; episode now ends ~9:55. What came out, per part:</w:t>
+      </w:r>
+    </w:p>
+    <w:p/>
+    <w:p>
+      <w:pPr>
+        <w:pStyle w:val="ListBullet"/>
+      </w:pPr>
+      <w:r>
+        <w:rPr>
+          <w:b/>
+        </w:rPr>
+        <w:t>Cold open (71→55):</w:t>
+      </w:r>
+      <w:r>
+        <w:t xml:space="preserve"> VO 1 and VO 3 tightened ("this video is for you… Let me show you" → "stay"); hook now fits 30s at real pacing. Translatable line 1 verbatim.</w:t>
+      </w:r>
+    </w:p>
+    <w:p>
+      <w:pPr>
+        <w:pStyle w:val="ListBullet"/>
+      </w:pPr>
+      <w:r>
+        <w:rPr>
+          <w:b/>
+        </w:rPr>
+        <w:t>Part 1 (274→177):</w:t>
+      </w:r>
+      <w:r>
+        <w:t xml:space="preserve"> cut "Because everybody sells 'speak without fear'…" (duplicated positioning, per editor); roadblock speech more than halved — the staged on-camera freeze itself untouched; Tuesday-"inventory" story compressed but still offhand and still carrying the reframe through the "Did you think I was stupid?" exchange; toolbox speech halved (the three-move menu survives); Maria's capers speech trimmed. The "voice in Spanish" confession, with its V1 callback, untouched.</w:t>
+      </w:r>
+    </w:p>
+    <w:p>
+      <w:pPr>
+        <w:pStyle w:val="ListBullet"/>
+      </w:pPr>
+      <w:r>
+        <w:rPr>
+          <w:b/>
+        </w:rPr>
+        <w:t>Part 2 (277→137, structural):</w:t>
+      </w:r>
+      <w:r>
+        <w:t xml:space="preserve"> three coaching cycles collapsed toward one — phrase 1's debrief and the pair's setup share one James speech; "secret of the freeze" down to two sentences; the "native phrase" debrief CUT and its claim folded into the pair's setup ("a pair native speakers use every day") — this also removes the flagged "meetings, on dates, on television" triple-list AI tell; phrase-4 setup trimmed; James's post-repeat validation line cut. All four phrases still model → repeat, and the customer's "Take your time, no rush" beat stays as the live proof.</w:t>
+      </w:r>
+    </w:p>
+    <w:p>
+      <w:pPr>
+        <w:pStyle w:val="ListBullet"/>
+      </w:pPr>
+      <w:r>
+        <w:rPr>
+          <w:b/>
+        </w:rPr>
+        <w:t>Part 3 (242→160):</w:t>
+      </w:r>
+      <w:r>
+        <w:t xml:space="preserve"> "Move two" opener loses the panic explanation, keeps "you lost one word, not the meaning"; "Look what happened" debrief merged into the phrase-6 segue; "watch his face" speech loses "Asking isn't defeat…" and "for ten seconds," absorbs the puzzle image; James's closing button cut — Maria's salmon reply now ends the part. The "asking hurts" exchange intact.</w:t>
+      </w:r>
+    </w:p>
+    <w:p>
+      <w:pPr>
+        <w:pStyle w:val="ListBullet"/>
+      </w:pPr>
+      <w:r>
+        <w:rPr>
+          <w:b/>
+        </w:rPr>
+        <w:t>Part 4 (349→235):</w:t>
+      </w:r>
+      <w:r>
+        <w:t xml:space="preserve"> phrase 7/8 framing tightened (both phrase-8 takes and the chin-up direction kept); "THAT one" speech loses the side-station restatement (established in Part 1); bar speech loses "One frozen sentence doesn't erase one shift of that…" (restated by recap Q5, per editor) and the fast-customers enumeration — the table-12 callback and "you're the only person in the building still carrying it" stay word-for-word. The bolded protected line and the hold after it are untouched.</w:t>
+      </w:r>
+    </w:p>
+    <w:p>
+      <w:pPr>
+        <w:pStyle w:val="ListBullet"/>
+      </w:pPr>
+      <w:r>
+        <w:rPr>
+          <w:b/>
+        </w:rPr>
+        <w:t>Part 5 (151→124):</w:t>
+      </w:r>
+      <w:r>
+        <w:t xml:space="preserve"> VO and tail trims only ("I want to be honest with you…" compressed; "Same word, same table" de-duplicated; "best thing on the menu" cut — the customer's "I helped" joke stands on its own). Double-freeze structure, all five returning phrases, and translatable line 2 (verbatim) untouched.</w:t>
+      </w:r>
+    </w:p>
+    <w:p>
+      <w:pPr>
+        <w:pStyle w:val="ListBullet"/>
+      </w:pPr>
+      <w:r>
+        <w:rPr>
+          <w:b/>
+        </w:rPr>
+        <w:t>Recap (177→138):</w:t>
+      </w:r>
+      <w:r>
+        <w:t xml:space="preserve"> stems and answer tails trimmed; all 8 phrases still covered (Q1: 1+4 · Q2: 2+3 · Q3: 5+6 · Q4: 7 · Q5: 8), Q → 3s pause → A rhythm unchanged; Q5's "one frozen sentence erases… nothing" kept — it now carries the beat cut from Part 4's bar speech.</w:t>
+      </w:r>
+    </w:p>
+    <w:p>
+      <w:pPr>
+        <w:pStyle w:val="ListBullet"/>
+      </w:pPr>
+      <w:r>
+        <w:rPr>
+          <w:b/>
+        </w:rPr>
+        <w:t>Outro (84→72):</w:t>
+      </w:r>
+      <w:r>
+        <w:t xml:space="preserve"> send-off tightened; the editor's level fix ("it comes with…") and the ep-8 money tease unchanged.</w:t>
       </w:r>
     </w:p>
     <w:sectPr>

</xml_diff>

<commit_message>
Episode 7 editor re-check: PASS - editor-passed, awaiting Ruthy review
1,052 dialogue words (~8.8-10 min), all protections verified, both
judgment-call cuts accepted, no seams. VO note: deliver at brisk 115-120 wpm.

Co-Authored-By: Claude Fable 5 <noreply@anthropic.com>
Claude-Session: https://claude.ai/code/session_01BbznzE6vYuuAPK9F9HY6r3
</commit_message>
<xml_diff>
--- a/restaurant-track/video-07-english-freezes/RAMP_EnglishFreezes_VideoScript.docx
+++ b/restaurant-track/video-07-english-freezes/RAMP_EnglishFreezes_VideoScript.docx
@@ -30,7 +30,7 @@
         <w:t>Status:</w:t>
       </w:r>
       <w:r>
-        <w:t xml:space="preserve"> DRAFT v3 — compressed per editor notes, awaiting editor re-check</w:t>
+        <w:t xml:space="preserve"> DRAFT v3 — editor-passed, awaiting Ruthy review</w:t>
       </w:r>
     </w:p>
     <w:p>
@@ -1983,6 +1983,92 @@
           <w:i/>
         </w:rPr>
         <w:t>(Minor, roll into the same pass: "Americans say it in meetings, on dates, on television" — the triple list reads written; two items land more spoken.)</w:t>
+      </w:r>
+    </w:p>
+    <w:p/>
+    <w:p>
+      <w:pPr>
+        <w:pStyle w:val="Heading2"/>
+      </w:pPr>
+      <w:r>
+        <w:t>Editor's changes (v3 re-check, 2026-07-17)</w:t>
+      </w:r>
+    </w:p>
+    <w:p/>
+    <w:p>
+      <w:r>
+        <w:t>Scoped re-check of the compression pass only — no line edits were needed.</w:t>
+      </w:r>
+    </w:p>
+    <w:p/>
+    <w:p>
+      <w:pPr>
+        <w:pStyle w:val="ListNumber"/>
+      </w:pPr>
+      <w:r>
+        <w:rPr>
+          <w:b/>
+        </w:rPr>
+        <w:t>Runtime — PASS:</w:t>
+      </w:r>
+      <w:r>
+        <w:t xml:space="preserve"> 1,052 dialogue words on the editor's counter (scriptwriter's tokenizer: 1,098; the ~4% delta matches the v2 counter gap). Under the 1,100 ceiling. Speech ≈ 8.8–10.0 min at 105–120 wpm; header timings ending 9:55 are honest at channel pacing. Note for VO direction: this sits at the ceiling — delivery should hold near the brisk end (115–120 wpm), since the episode's silence design spends its slack on the designed beats, not slower speech.</w:t>
+      </w:r>
+    </w:p>
+    <w:p>
+      <w:pPr>
+        <w:pStyle w:val="ListNumber"/>
+      </w:pPr>
+      <w:r>
+        <w:rPr>
+          <w:b/>
+        </w:rPr>
+        <w:t>Judgment call — Part 3 closing button cut: ACCEPTED.</w:t>
+      </w:r>
+      <w:r>
+        <w:t xml:space="preserve"> Ending on Maria's "except one word" line is the better landing; restoring James's button would reintroduce the every-scene-ends-on-a-bow tell flagged at v2. Part 4's "Last move" segue resolves cleanly to Part 1's three-move menu.</w:t>
+      </w:r>
+    </w:p>
+    <w:p>
+      <w:pPr>
+        <w:pStyle w:val="ListNumber"/>
+      </w:pPr>
+      <w:r>
+        <w:rPr>
+          <w:b/>
+        </w:rPr>
+        <w:t>Judgment call — Part 5 "best thing on the menu tonight" tail cut: ACCEPTED.</w:t>
+      </w:r>
+      <w:r>
+        <w:t xml:space="preserve"> "Now I have to order it. I helped." carries the teammate payoff alone; the tail was a duplicate beat, and the faster hand-off into the live "Where was I? — Right." is the stronger rhythm.</w:t>
+      </w:r>
+    </w:p>
+    <w:p>
+      <w:pPr>
+        <w:pStyle w:val="ListNumber"/>
+      </w:pPr>
+      <w:r>
+        <w:rPr>
+          <w:b/>
+        </w:rPr>
+        <w:t>Seam check (Parts 1–4): clean.</w:t>
+      </w:r>
+      <w:r>
+        <w:t xml:space="preserve"> All post-compression segues have antecedents ("Move two"/"Last move" → Part 1's menu; "the sound I used on you earlier" → the roadblock; "what was the voice saying?" → the Part 1 confession). Maria's "And you're the customer" now anticipates rather than responds, but reads as series-format familiarity, not a gap — left as is.</w:t>
+      </w:r>
+    </w:p>
+    <w:p>
+      <w:pPr>
+        <w:pStyle w:val="ListNumber"/>
+      </w:pPr>
+      <w:r>
+        <w:rPr>
+          <w:b/>
+        </w:rPr>
+        <w:t>Protections verified intact:</w:t>
+      </w:r>
+      <w:r>
+        <w:t xml:space="preserve"> all 8 phrases modeled + repeated; recap covers all 8 with phrase 4 in Q1; both protected beats verbatim with the hold preserved; all three scripted silences; the table-12 V6 callback; both TRANSLATABLE VO lines verbatim.</w:t>
       </w:r>
     </w:p>
     <w:p/>

</xml_diff>